<commit_message>
docs(report): add sections 5 (frontend), 6, 7 and Adam's individual report
Approx. time spent (min) : 90
</commit_message>
<xml_diff>
--- a/docs/report/15_Midterm.docx
+++ b/docs/report/15_Midterm.docx
@@ -894,7 +894,7 @@
               <w:rPr>
                 <w:sz w:val="19"/>
               </w:rPr>
-              <w:t xml:space="preserve">Backend complete; map UI in progress</w:t>
+              <w:t>Complete on a temporary layout (backend + map UI)</w:t>
             </w:r>
           </w:p>
         </w:tc>
@@ -947,7 +947,7 @@
               <w:rPr>
                 <w:sz w:val="19"/>
               </w:rPr>
-              <w:t xml:space="preserve">Backend complete; buttons in progress</w:t>
+              <w:t>Complete (backend + buttons)</w:t>
             </w:r>
           </w:p>
         </w:tc>
@@ -1291,7 +1291,7 @@
               <w:rPr>
                 <w:sz w:val="19"/>
               </w:rPr>
-              <w:t xml:space="preserve">Backend: automated test. UI: screenshot (to come)</w:t>
+              <w:t>Backend: automated test. UI: screenshot (A3)</w:t>
             </w:r>
           </w:p>
         </w:tc>
@@ -1344,7 +1344,7 @@
               <w:rPr>
                 <w:sz w:val="19"/>
               </w:rPr>
-              <w:t xml:space="preserve">Backend: automated test. UI: screenshot (to come)</w:t>
+              <w:t>Backend: automated test. UI: screenshot (A3)</w:t>
             </w:r>
           </w:p>
         </w:tc>
@@ -1477,7 +1477,7 @@
               <w:rPr>
                 <w:sz w:val="19"/>
               </w:rPr>
-              <w:t xml:space="preserve">Backend: automated test + manual API check</w:t>
+              <w:t>Backend: automated test + manual API check. UI: screenshot (A3)</w:t>
             </w:r>
           </w:p>
         </w:tc>
@@ -1530,7 +1530,7 @@
               <w:rPr>
                 <w:sz w:val="19"/>
               </w:rPr>
-              <w:t xml:space="preserve">Backend: automated test + manual API check</w:t>
+              <w:t>Backend: automated test + manual API check. UI: screenshot (A3)</w:t>
             </w:r>
           </w:p>
         </w:tc>
@@ -1925,16 +1925,9 @@
             </w:pPr>
             <w:r>
               <w:rPr>
-                <w:rFonts w:ascii="Consolas" w:hAnsi="Consolas" w:cs="Consolas"/>
                 <w:sz w:val="19"/>
               </w:rPr>
-              <w:t xml:space="preserve">app/page.tsx</w:t>
-            </w:r>
-            <w:r>
-              <w:rPr>
-                <w:sz w:val="19"/>
-              </w:rPr>
-              <w:t xml:space="preserve"> (in progress)</w:t>
+              <w:t>app/page.tsx</w:t>
             </w:r>
           </w:p>
         </w:tc>
@@ -2462,20 +2455,30 @@
         <w:rPr>
           <w:b/>
         </w:rPr>
-        <w:t xml:space="preserve">What we have checked about D1 so far.</w:t>
+        <w:t>What we have checked about D1 so far.</w:t>
       </w:r>
       <w:r>
         <w:t xml:space="preserve"> R1 and R2 were decided after Architecture v1. Both are implemented only in </w:t>
       </w:r>
       <w:r>
         <w:rPr>
-          <w:rFonts w:ascii="Consolas" w:hAnsi="Consolas" w:cs="Consolas"/>
+          <w:rFonts w:ascii="Consolas" w:hAnsi="Consolas"/>
           <w:sz w:val="19"/>
         </w:rPr>
-        <w:t xml:space="preserve">lib/seatStatus.ts</w:t>
-      </w:r>
-      <w:r>
-        <w:t xml:space="preserve"> (C2). The API contract, written before the code, did not need to change when the rules were implemented, and the tests for S1-AC1 and S1-AC2 pass with the rules in place. C1 is not finished, so we cannot yet show that the UI needs no change when a rule changes; we will check it by changing the R2 duration once C1 exists.</w:t>
+        <w:t>lib/seatStatus.ts</w:t>
+      </w:r>
+      <w:r>
+        <w:t xml:space="preserve"> (C2). The API contract, written before the code, did not need to change when the rules were implemented, and the tests for S1-AC1 and S1-AC2 pass with the rules in place. Once C1 existed, we changed the R2 duration to 5 seconds in C2 only: the map showed the table free again after 5 seconds, with no change to </w:t>
+      </w:r>
+      <w:r>
+        <w:rPr>
+          <w:rFonts w:ascii="Consolas" w:hAnsi="Consolas"/>
+          <w:sz w:val="19"/>
+        </w:rPr>
+        <w:t>app/page.tsx</w:t>
+      </w:r>
+      <w:r>
+        <w:t xml:space="preserve"> (A3).</w:t>
       </w:r>
     </w:p>
     <w:p>
@@ -2491,10 +2494,10 @@
         <w:rPr>
           <w:b/>
         </w:rPr>
-        <w:t xml:space="preserve">Working core feature (backend).</w:t>
-      </w:r>
-      <w:r>
-        <w:t xml:space="preserve"> The full status logic of S1 and S2 runs behind the API. A student's check-in makes the table occupied, a second check-in is refused, only the token holder can free the table, and the map data reports when no table is free.</w:t>
+        <w:t>Working core feature.</w:t>
+      </w:r>
+      <w:r>
+        <w:t xml:space="preserve"> S1 and S2 work end to end in the browser. A student's check-in makes the table occupied on the map, a second check-in is refused, only the token holder can free the table, and the map shows a message when no table is free.</w:t>
       </w:r>
     </w:p>
     <w:tbl>
@@ -2725,7 +2728,7 @@
               <w:rPr>
                 <w:sz w:val="19"/>
               </w:rPr>
-              <w:t xml:space="preserve">In progress (Adam)</w:t>
+              <w:t>Complete (Adam)</w:t>
             </w:r>
           </w:p>
         </w:tc>
@@ -2739,10 +2742,9 @@
             </w:pPr>
             <w:r>
               <w:rPr>
-                <w:i/>
                 <w:sz w:val="19"/>
               </w:rPr>
-              <w:t xml:space="preserve">Screenshots to add</w:t>
+              <w:t>Browser check (A3)</w:t>
             </w:r>
           </w:p>
         </w:tc>
@@ -2779,7 +2781,7 @@
               <w:rPr>
                 <w:sz w:val="19"/>
               </w:rPr>
-              <w:t xml:space="preserve">In progress (Adam)</w:t>
+              <w:t>Complete (Adam)</w:t>
             </w:r>
           </w:p>
         </w:tc>
@@ -2793,10 +2795,9 @@
             </w:pPr>
             <w:r>
               <w:rPr>
-                <w:i/>
                 <w:sz w:val="19"/>
               </w:rPr>
-              <w:t xml:space="preserve">Screenshots to add</w:t>
+              <w:t>Browser check (A3)</w:t>
             </w:r>
           </w:p>
         </w:tc>
@@ -3023,6 +3024,20 @@
       </w:r>
     </w:p>
     <w:p>
+      <w:pPr>
+        <w:pStyle w:val="ListBullet"/>
+      </w:pPr>
+      <w:r>
+        <w:rPr>
+          <w:b/>
+        </w:rPr>
+        <w:t>Browser check of the UI, 5/5.</w:t>
+      </w:r>
+      <w:r>
+        <w:t xml:space="preserve"> On the production build, five steps covering S1-AC1, S1-AC2, S2-AC1, S2-AC2, R1 and the wrong-token case each showed the expected statuses and messages. Run by Adam on 2026-10-17 (A3).</w:t>
+      </w:r>
+    </w:p>
+    <w:p>
       <w:r>
         <w:rPr>
           <w:b/>
@@ -3055,15 +3070,87 @@
       </w:r>
     </w:p>
     <w:p>
-      <w:pPr>
-        <w:shd w:val="clear" w:color="auto" w:fill="FFF2CC"/>
-      </w:pPr>
+      <w:pPr/>
       <w:r>
         <w:rPr>
-          <w:i/>
-          <w:color w:val="7F6000"/>
+          <w:b/>
         </w:rPr>
-        <w:t xml:space="preserve">[Front-end part — Adam LARKEM (issue #18): state of C1 and the S2 buttons, screenshots for S1-AC1, S1-AC2, S2-AC1, S2-AC2.]</w:t>
+        <w:t>Front-end part (Adam).</w:t>
+      </w:r>
+      <w:r>
+        <w:t xml:space="preserve"> C1 is implemented in </w:t>
+      </w:r>
+      <w:r>
+        <w:rPr>
+          <w:rFonts w:ascii="Consolas" w:hAnsi="Consolas"/>
+          <w:sz w:val="19"/>
+        </w:rPr>
+        <w:t>app/page.tsx</w:t>
+      </w:r>
+      <w:r>
+        <w:t xml:space="preserve">. It calls </w:t>
+      </w:r>
+      <w:r>
+        <w:rPr>
+          <w:rFonts w:ascii="Consolas" w:hAnsi="Consolas"/>
+          <w:sz w:val="19"/>
+        </w:rPr>
+        <w:t>GET /api/tables</w:t>
+      </w:r>
+      <w:r>
+        <w:t xml:space="preserve">, draws the grid from each table's row and column, and gives each table a colour and a text label (free / occupied), so the status does not rely on colour alone. When </w:t>
+      </w:r>
+      <w:r>
+        <w:rPr>
+          <w:rFonts w:ascii="Consolas" w:hAnsi="Consolas"/>
+          <w:sz w:val="19"/>
+        </w:rPr>
+        <w:t>noFreeTable</w:t>
+      </w:r>
+      <w:r>
+        <w:t xml:space="preserve"> is true, it shows "No free table reported right now" above the map. Selecting a table enables "I'm sitting here", which calls check-in and keeps the </w:t>
+      </w:r>
+      <w:r>
+        <w:rPr>
+          <w:rFonts w:ascii="Consolas" w:hAnsi="Consolas"/>
+          <w:sz w:val="19"/>
+        </w:rPr>
+        <w:t>checkinToken</w:t>
+      </w:r>
+      <w:r>
+        <w:t xml:space="preserve"> in the browser (</w:t>
+      </w:r>
+      <w:r>
+        <w:rPr>
+          <w:rFonts w:ascii="Consolas" w:hAnsi="Consolas"/>
+          <w:sz w:val="19"/>
+        </w:rPr>
+        <w:t>localStorage</w:t>
+      </w:r>
+      <w:r>
+        <w:t xml:space="preserve">), and "I'm leaving", which sends the token back. For 403 and 409 the UI shows the </w:t>
+      </w:r>
+      <w:r>
+        <w:rPr>
+          <w:rFonts w:ascii="Consolas" w:hAnsi="Consolas"/>
+          <w:sz w:val="19"/>
+        </w:rPr>
+        <w:t>error.message</w:t>
+      </w:r>
+      <w:r>
+        <w:t xml:space="preserve"> returned by C2 unchanged, then reloads the map. C1 applies no status rule (D1).</w:t>
+      </w:r>
+    </w:p>
+    <w:p>
+      <w:pPr/>
+      <w:r>
+        <w:rPr>
+          <w:b/>
+        </w:rPr>
+        <w:t>Not done on the UI side.</w:t>
+      </w:r>
+      <w:r>
+        <w:t xml:space="preserve"> The map reloads when the page opens and after the student's own action; another student's change appears only after a reload (automatic refresh planned, section 7). The UI has no automated test: it is checked by hand in the browser (A3).</w:t>
       </w:r>
     </w:p>
     <w:p>
@@ -3075,15 +3162,93 @@
       </w:r>
     </w:p>
     <w:p>
-      <w:pPr>
-        <w:shd w:val="clear" w:color="auto" w:fill="FFF2CC"/>
-      </w:pPr>
+      <w:pPr/>
       <w:r>
         <w:rPr>
-          <w:i/>
-          <w:color w:val="7F6000"/>
+          <w:b/>
         </w:rPr>
-        <w:t xml:space="preserve">[To be written by Adam LARKEM (issue #19). Implemented and tested: check-out requires the check-in token (403 otherwise); no account, name or student ID is stored with a check-in. Evidence: A1, A2 step 4.]</w:t>
+        <w:t>Risk: anyone can free someone else's table.</w:t>
+      </w:r>
+      <w:r>
+        <w:t xml:space="preserve"> Check-out is a request that any browser can send for any table ID. Without a check, a student could free a table where someone is sitting, by mistake or on purpose, and the map would send other students to it. This is an integrity and authorization risk: a request acts on an object the caller does not own (Week 7, IDOR). It hits S1 and S2 directly, because the map can no longer be trusted.</w:t>
+      </w:r>
+    </w:p>
+    <w:p>
+      <w:pPr/>
+      <w:r>
+        <w:rPr>
+          <w:b/>
+        </w:rPr>
+        <w:t>Response.</w:t>
+      </w:r>
+      <w:r>
+        <w:t xml:space="preserve"> Check-in returns a random token (UUID v4) and check-out requires it. With another token the API answers 403 </w:t>
+      </w:r>
+      <w:r>
+        <w:rPr>
+          <w:rFonts w:ascii="Consolas" w:hAnsi="Consolas"/>
+          <w:sz w:val="19"/>
+        </w:rPr>
+        <w:t>INVALID_TOKEN</w:t>
+      </w:r>
+      <w:r>
+        <w:t xml:space="preserve"> and the table stays occupied. The check lives in C2 only (</w:t>
+      </w:r>
+      <w:r>
+        <w:rPr>
+          <w:rFonts w:ascii="Consolas" w:hAnsi="Consolas"/>
+          <w:sz w:val="19"/>
+        </w:rPr>
+        <w:t>lib/seatStatus.ts</w:t>
+      </w:r>
+      <w:r>
+        <w:t>). We chose this over user accounts: there is no login, and the server stores only the table ID, the token and the check-in time, with no name, student ID or IP address (data minimization, Week 7). The token stays in the student's browser.</w:t>
+      </w:r>
+    </w:p>
+    <w:p>
+      <w:pPr/>
+      <w:r>
+        <w:rPr>
+          <w:b/>
+        </w:rPr>
+        <w:t>Executed check.</w:t>
+      </w:r>
+      <w:r>
+        <w:t xml:space="preserve"> Automated test </w:t>
+      </w:r>
+      <w:r>
+        <w:rPr>
+          <w:rFonts w:ascii="Consolas" w:hAnsi="Consolas"/>
+          <w:sz w:val="19"/>
+        </w:rPr>
+        <w:t>security: check-out with another token returns 403 and the table stays occupied</w:t>
+      </w:r>
+      <w:r>
+        <w:t xml:space="preserve"> (A1); manual API check step 4, 403 with the expected message (A2); and on screen, with the stored token replaced by another student's: "Only the student who checked in can free this table.", T2 still occupied (A3).</w:t>
+      </w:r>
+    </w:p>
+    <w:p>
+      <w:pPr/>
+      <w:r>
+        <w:rPr>
+          <w:b/>
+        </w:rPr>
+        <w:t>Remaining limits.</w:t>
+      </w:r>
+      <w:r>
+        <w:t xml:space="preserve"> The token is a bearer secret: whoever holds it can check out, so a deployed version must use HTTPS (local runs use HTTP). Nothing stops one person from checking in at several tables or sending many check-ins (no rate limit, backlog X2). We accept this for the MVP and revisit it after the user test.</w:t>
+      </w:r>
+    </w:p>
+    <w:p>
+      <w:pPr/>
+      <w:r>
+        <w:rPr>
+          <w:b/>
+        </w:rPr>
+        <w:t>Privacy of "open to company" (F3, not built yet).</w:t>
+      </w:r>
+      <w:r>
+        <w:t xml:space="preserve"> It would show on a public map that a person is eating alone at a given table, which could help a stranger find and approach them. If we build F3, it must be opt-in and off by default, carry no name or photo, and end with the check-in.</w:t>
       </w:r>
     </w:p>
     <w:p>
@@ -3095,15 +3260,371 @@
       </w:r>
     </w:p>
     <w:p>
+      <w:pPr/>
+      <w:r>
+        <w:t>The midterm shows S1 and S2 working on a temporary layout. Remaining priorities, in order:</w:t>
+      </w:r>
+    </w:p>
+    <w:tbl>
+      <w:tblPr>
+        <w:tblStyle w:val="TableGrid"/>
+        <w:tblW w:w="9893" w:type="dxa"/>
+        <w:tblLayout w:type="fixed"/>
+        <w:tblCellMar>
+          <w:top w:w="40" w:type="dxa"/>
+          <w:left w:w="80" w:type="dxa"/>
+          <w:bottom w:w="40" w:type="dxa"/>
+          <w:right w:w="80" w:type="dxa"/>
+        </w:tblCellMar>
+      </w:tblPr>
+      <w:tblGrid>
+        <w:gridCol w:w="5000"/>
+        <w:gridCol w:w="900"/>
+        <w:gridCol w:w="3993"/>
+      </w:tblGrid>
+      <w:tr>
+        <w:trPr>
+          <w:tblHeader/>
+          <w:cantSplit/>
+        </w:trPr>
+        <w:tc>
+          <w:tcPr>
+            <w:tcW w:w="4649" w:type="dxa"/>
+            <w:shd w:val="clear" w:color="auto" w:fill="D9E2F3"/>
+          </w:tcPr>
+          <w:p>
+            <w:pPr>
+              <w:spacing w:before="0" w:after="0"/>
+            </w:pPr>
+            <w:r>
+              <w:rPr>
+                <w:b/>
+                <w:sz w:val="19"/>
+              </w:rPr>
+              <w:t>Priority</w:t>
+            </w:r>
+          </w:p>
+        </w:tc>
+        <w:tc>
+          <w:tcPr>
+            <w:tcW w:w="2154" w:type="dxa"/>
+            <w:shd w:val="clear" w:color="auto" w:fill="D9E2F3"/>
+          </w:tcPr>
+          <w:p>
+            <w:pPr>
+              <w:spacing w:before="0" w:after="0"/>
+            </w:pPr>
+            <w:r>
+              <w:rPr>
+                <w:b/>
+                <w:sz w:val="19"/>
+              </w:rPr>
+              <w:t>Owner, target</w:t>
+            </w:r>
+          </w:p>
+        </w:tc>
+        <w:tc>
+          <w:tcPr>
+            <w:tcW w:w="3061" w:type="dxa"/>
+            <w:shd w:val="clear" w:color="auto" w:fill="D9E2F3"/>
+          </w:tcPr>
+          <w:p>
+            <w:pPr>
+              <w:spacing w:before="0" w:after="0"/>
+            </w:pPr>
+            <w:r>
+              <w:rPr>
+                <w:b/>
+                <w:sz w:val="19"/>
+              </w:rPr>
+              <w:t>Done when</w:t>
+            </w:r>
+          </w:p>
+        </w:tc>
+      </w:tr>
+      <w:tr>
+        <w:trPr>
+          <w:cantSplit/>
+        </w:trPr>
+        <w:tc>
+          <w:tcPr>
+            <w:tcW w:w="4649" w:type="dxa"/>
+          </w:tcPr>
+          <w:p>
+            <w:pPr>
+              <w:spacing w:before="0" w:after="0"/>
+            </w:pPr>
+            <w:r>
+              <w:rPr>
+                <w:sz w:val="19"/>
+              </w:rPr>
+              <w:t>1. Real cafeteria layout (P2): sketch the room, replace data/layout.json</w:t>
+            </w:r>
+          </w:p>
+        </w:tc>
+        <w:tc>
+          <w:tcPr>
+            <w:tcW w:w="2154" w:type="dxa"/>
+          </w:tcPr>
+          <w:p>
+            <w:pPr>
+              <w:spacing w:before="0" w:after="0"/>
+            </w:pPr>
+            <w:r>
+              <w:rPr>
+                <w:sz w:val="19"/>
+              </w:rPr>
+              <w:t>Esteve, Week 9</w:t>
+            </w:r>
+          </w:p>
+        </w:tc>
+        <w:tc>
+          <w:tcPr>
+            <w:tcW w:w="3061" w:type="dxa"/>
+          </w:tcPr>
+          <w:p>
+            <w:pPr>
+              <w:spacing w:before="0" w:after="0"/>
+            </w:pPr>
+            <w:r>
+              <w:rPr>
+                <w:sz w:val="19"/>
+              </w:rPr>
+              <w:t>Map matches the room; API unchanged</w:t>
+            </w:r>
+          </w:p>
+        </w:tc>
+      </w:tr>
+      <w:tr>
+        <w:trPr>
+          <w:cantSplit/>
+        </w:trPr>
+        <w:tc>
+          <w:tcPr>
+            <w:tcW w:w="4649" w:type="dxa"/>
+          </w:tcPr>
+          <w:p>
+            <w:pPr>
+              <w:spacing w:before="0" w:after="0"/>
+            </w:pPr>
+            <w:r>
+              <w:rPr>
+                <w:sz w:val="19"/>
+              </w:rPr>
+              <w:t>2. Mockup user test (P1) with 8–10 students</w:t>
+            </w:r>
+          </w:p>
+        </w:tc>
+        <w:tc>
+          <w:tcPr>
+            <w:tcW w:w="2154" w:type="dxa"/>
+          </w:tcPr>
+          <w:p>
+            <w:pPr>
+              <w:spacing w:before="0" w:after="0"/>
+            </w:pPr>
+            <w:r>
+              <w:rPr>
+                <w:sz w:val="19"/>
+              </w:rPr>
+              <w:t>Both, Week 9</w:t>
+            </w:r>
+          </w:p>
+        </w:tc>
+        <w:tc>
+          <w:tcPr>
+            <w:tcW w:w="3061" w:type="dxa"/>
+          </w:tcPr>
+          <w:p>
+            <w:pPr>
+              <w:spacing w:before="0" w:after="0"/>
+            </w:pPr>
+            <w:r>
+              <w:rPr>
+                <w:sz w:val="19"/>
+              </w:rPr>
+              <w:t>Results reported against the M1 thresholds (70% check in without help, 30% turn on "open to company")</w:t>
+            </w:r>
+          </w:p>
+        </w:tc>
+      </w:tr>
+      <w:tr>
+        <w:trPr>
+          <w:cantSplit/>
+        </w:trPr>
+        <w:tc>
+          <w:tcPr>
+            <w:tcW w:w="4649" w:type="dxa"/>
+          </w:tcPr>
+          <w:p>
+            <w:pPr>
+              <w:spacing w:before="0" w:after="0"/>
+            </w:pPr>
+            <w:r>
+              <w:rPr>
+                <w:sz w:val="19"/>
+              </w:rPr>
+              <w:t>3. Automatic map refresh, so other students' check-ins appear without a reload</w:t>
+            </w:r>
+          </w:p>
+        </w:tc>
+        <w:tc>
+          <w:tcPr>
+            <w:tcW w:w="2154" w:type="dxa"/>
+          </w:tcPr>
+          <w:p>
+            <w:pPr>
+              <w:spacing w:before="0" w:after="0"/>
+            </w:pPr>
+            <w:r>
+              <w:rPr>
+                <w:sz w:val="19"/>
+              </w:rPr>
+              <w:t>Adam, Week 9</w:t>
+            </w:r>
+          </w:p>
+        </w:tc>
+        <w:tc>
+          <w:tcPr>
+            <w:tcW w:w="3061" w:type="dxa"/>
+          </w:tcPr>
+          <w:p>
+            <w:pPr>
+              <w:spacing w:before="0" w:after="0"/>
+            </w:pPr>
+            <w:r>
+              <w:rPr>
+                <w:sz w:val="19"/>
+              </w:rPr>
+              <w:t>Two browsers open: a check-in in one shows in the other within 10 s</w:t>
+            </w:r>
+          </w:p>
+        </w:tc>
+      </w:tr>
+      <w:tr>
+        <w:trPr>
+          <w:cantSplit/>
+        </w:trPr>
+        <w:tc>
+          <w:tcPr>
+            <w:tcW w:w="4649" w:type="dxa"/>
+          </w:tcPr>
+          <w:p>
+            <w:pPr>
+              <w:spacing w:before="0" w:after="0"/>
+            </w:pPr>
+            <w:r>
+              <w:rPr>
+                <w:sz w:val="19"/>
+              </w:rPr>
+              <w:t>4. MVP demo (M4): S1 and S2 on the real layout</w:t>
+            </w:r>
+          </w:p>
+        </w:tc>
+        <w:tc>
+          <w:tcPr>
+            <w:tcW w:w="2154" w:type="dxa"/>
+          </w:tcPr>
+          <w:p>
+            <w:pPr>
+              <w:spacing w:before="0" w:after="0"/>
+            </w:pPr>
+            <w:r>
+              <w:rPr>
+                <w:sz w:val="19"/>
+              </w:rPr>
+              <w:t>Both, Week 10</w:t>
+            </w:r>
+          </w:p>
+        </w:tc>
+        <w:tc>
+          <w:tcPr>
+            <w:tcW w:w="3061" w:type="dxa"/>
+          </w:tcPr>
+          <w:p>
+            <w:pPr>
+              <w:spacing w:before="0" w:after="0"/>
+            </w:pPr>
+            <w:r>
+              <w:rPr>
+                <w:sz w:val="19"/>
+              </w:rPr>
+              <w:t>S1-AC1 to S2-AC2 shown live</w:t>
+            </w:r>
+          </w:p>
+        </w:tc>
+      </w:tr>
+      <w:tr>
+        <w:trPr>
+          <w:cantSplit/>
+        </w:trPr>
+        <w:tc>
+          <w:tcPr>
+            <w:tcW w:w="4649" w:type="dxa"/>
+          </w:tcPr>
+          <w:p>
+            <w:pPr>
+              <w:spacing w:before="0" w:after="0"/>
+            </w:pPr>
+            <w:r>
+              <w:rPr>
+                <w:sz w:val="19"/>
+              </w:rPr>
+              <w:t>5. S3 "open to company" (F3), only if P1 supports it</w:t>
+            </w:r>
+          </w:p>
+        </w:tc>
+        <w:tc>
+          <w:tcPr>
+            <w:tcW w:w="2154" w:type="dxa"/>
+          </w:tcPr>
+          <w:p>
+            <w:pPr>
+              <w:spacing w:before="0" w:after="0"/>
+            </w:pPr>
+            <w:r>
+              <w:rPr>
+                <w:sz w:val="19"/>
+              </w:rPr>
+              <w:t>Adam (UI), Esteve (C2, API), after M4</w:t>
+            </w:r>
+          </w:p>
+        </w:tc>
+        <w:tc>
+          <w:tcPr>
+            <w:tcW w:w="3061" w:type="dxa"/>
+          </w:tcPr>
+          <w:p>
+            <w:pPr>
+              <w:spacing w:before="0" w:after="0"/>
+            </w:pPr>
+            <w:r>
+              <w:rPr>
+                <w:sz w:val="19"/>
+              </w:rPr>
+              <w:t>Opt-in status on the map, with the privacy rules of section 6</w:t>
+            </w:r>
+          </w:p>
+        </w:tc>
+      </w:tr>
+    </w:tbl>
+    <w:p>
       <w:pPr>
-        <w:shd w:val="clear" w:color="auto" w:fill="FFF2CC"/>
+        <w:spacing w:after="60"/>
       </w:pPr>
+    </w:p>
+    <w:p>
+      <w:pPr>
+        <w:spacing w:after="60"/>
+      </w:pPr>
       <w:r>
         <w:rPr>
-          <w:i/>
-          <w:color w:val="7F6000"/>
+          <w:b/>
         </w:rPr>
-        <w:t xml:space="preserve">[To be written by Adam LARKEM (issue #20): remaining priorities, owners, target weeks, main risk.]</w:t>
+        <w:t>Main risk.</w:t>
+      </w:r>
+      <w:r>
+        <w:t xml:space="preserve"> Students do not check in and out reliably (M1 assumption #2, our riskiest). The map would then show taken tables as free, and S1 loses its value. P1 measures it before we build F3: if fewer than 70% complete the check-in without help, we simplify the check-in flow first and keep F3 out of the final demo. R2 already limits how long a forgotten check-in stays on the map (60 minutes).</w:t>
       </w:r>
     </w:p>
     <w:p>
@@ -3407,22 +3928,242 @@
         <w:pStyle w:val="Heading2"/>
       </w:pPr>
       <w:r>
+        <w:t>A3 UI screenshots — supports S1-AC1, S1-AC2, S2-AC1, S2-AC2, R1, token check</w:t>
+      </w:r>
+    </w:p>
+    <w:p>
+      <w:pPr/>
+      <w:r>
+        <w:t xml:space="preserve">Production build in a browser, run by Adam LARKEM on 2026-10-17, branch </w:t>
+      </w:r>
+      <w:r>
         <w:rPr>
-          <w:sz w:val="22"/>
+          <w:rFonts w:ascii="Consolas" w:hAnsi="Consolas"/>
+          <w:sz w:val="19"/>
         </w:rPr>
-        <w:t xml:space="preserve">A3 UI screenshots — supports S1-AC1, S1-AC2, S2-AC1, S2-AC2</w:t>
+        <w:t>feat/c1-map-ui</w:t>
+      </w:r>
+      <w:r>
+        <w:t xml:space="preserve">. Steps and expected results: </w:t>
+      </w:r>
+      <w:r>
+        <w:rPr>
+          <w:rFonts w:ascii="Consolas" w:hAnsi="Consolas"/>
+          <w:sz w:val="19"/>
+        </w:rPr>
+        <w:t>docs/evidence/2026-10-17_c1_ui_check.md</w:t>
+      </w:r>
+      <w:r>
+        <w:t>.</w:t>
+      </w:r>
+    </w:p>
+    <w:p>
+      <w:pPr/>
+      <w:r>
+        <w:drawing>
+          <wp:inline xmlns:a="http://schemas.openxmlformats.org/drawingml/2006/main" xmlns:pic="http://schemas.openxmlformats.org/drawingml/2006/picture">
+            <wp:extent cx="3024000" cy="2268000"/>
+            <wp:docPr id="4" name="Picture 4"/>
+            <wp:cNvGraphicFramePr>
+              <a:graphicFrameLocks noChangeAspect="1"/>
+            </wp:cNvGraphicFramePr>
+            <a:graphic>
+              <a:graphicData uri="http://schemas.openxmlformats.org/drawingml/2006/picture">
+                <pic:pic>
+                  <pic:nvPicPr>
+                    <pic:cNvPr id="0" name="2026-10-17_c1_s1-ac1_s2-ac1_checkin.jpg"/>
+                    <pic:cNvPicPr/>
+                  </pic:nvPicPr>
+                  <pic:blipFill>
+                    <a:blip r:embed="rId8"/>
+                    <a:stretch>
+                      <a:fillRect/>
+                    </a:stretch>
+                  </pic:blipFill>
+                  <pic:spPr>
+                    <a:xfrm>
+                      <a:off x="0" y="0"/>
+                      <a:ext cx="3024000" cy="2268000"/>
+                    </a:xfrm>
+                    <a:prstGeom prst="rect"/>
+                  </pic:spPr>
+                </pic:pic>
+              </a:graphicData>
+            </a:graphic>
+          </wp:inline>
+        </w:drawing>
+      </w:r>
+      <w:r>
+        <w:t xml:space="preserve">  </w:t>
+      </w:r>
+      <w:r>
+        <w:drawing>
+          <wp:inline xmlns:a="http://schemas.openxmlformats.org/drawingml/2006/main" xmlns:pic="http://schemas.openxmlformats.org/drawingml/2006/picture">
+            <wp:extent cx="3024000" cy="2268000"/>
+            <wp:docPr id="5" name="Picture 5"/>
+            <wp:cNvGraphicFramePr>
+              <a:graphicFrameLocks noChangeAspect="1"/>
+            </wp:cNvGraphicFramePr>
+            <a:graphic>
+              <a:graphicData uri="http://schemas.openxmlformats.org/drawingml/2006/picture">
+                <pic:pic>
+                  <pic:nvPicPr>
+                    <pic:cNvPr id="0" name="2026-10-17_c1_s1-ac2_no_free_table.jpg"/>
+                    <pic:cNvPicPr/>
+                  </pic:nvPicPr>
+                  <pic:blipFill>
+                    <a:blip r:embed="rId9"/>
+                    <a:stretch>
+                      <a:fillRect/>
+                    </a:stretch>
+                  </pic:blipFill>
+                  <pic:spPr>
+                    <a:xfrm>
+                      <a:off x="0" y="0"/>
+                      <a:ext cx="3024000" cy="2268000"/>
+                    </a:xfrm>
+                    <a:prstGeom prst="rect"/>
+                  </pic:spPr>
+                </pic:pic>
+              </a:graphicData>
+            </a:graphic>
+          </wp:inline>
+        </w:drawing>
       </w:r>
     </w:p>
     <w:p>
       <w:pPr>
-        <w:shd w:val="clear" w:color="auto" w:fill="FFF2CC"/>
+        <w:pStyle w:val="Caption"/>
       </w:pPr>
       <w:r>
-        <w:rPr>
-          <w:i/>
-          <w:color w:val="7F6000"/>
-        </w:rPr>
-        <w:t xml:space="preserve">[Adam LARKEM (issue #18): screenshots of the map and the S2 buttons.]</w:t>
+        <w:t>Figure A3a (left). S1-AC1, S2-AC1: after "I'm sitting here" on T2, T2 is occupied and T1 free. Figure A3b (right). S1-AC2: every table occupied, message above the map.</w:t>
+      </w:r>
+    </w:p>
+    <w:p>
+      <w:pPr/>
+      <w:r>
+        <w:drawing>
+          <wp:inline xmlns:a="http://schemas.openxmlformats.org/drawingml/2006/main" xmlns:pic="http://schemas.openxmlformats.org/drawingml/2006/picture">
+            <wp:extent cx="3024000" cy="2268000"/>
+            <wp:docPr id="6" name="Picture 6"/>
+            <wp:cNvGraphicFramePr>
+              <a:graphicFrameLocks noChangeAspect="1"/>
+            </wp:cNvGraphicFramePr>
+            <a:graphic>
+              <a:graphicData uri="http://schemas.openxmlformats.org/drawingml/2006/picture">
+                <pic:pic>
+                  <pic:nvPicPr>
+                    <pic:cNvPr id="0" name="2026-10-17_c1_r1_occupied_409.jpg"/>
+                    <pic:cNvPicPr/>
+                  </pic:nvPicPr>
+                  <pic:blipFill>
+                    <a:blip r:embed="rId10"/>
+                    <a:stretch>
+                      <a:fillRect/>
+                    </a:stretch>
+                  </pic:blipFill>
+                  <pic:spPr>
+                    <a:xfrm>
+                      <a:off x="0" y="0"/>
+                      <a:ext cx="3024000" cy="2268000"/>
+                    </a:xfrm>
+                    <a:prstGeom prst="rect"/>
+                  </pic:spPr>
+                </pic:pic>
+              </a:graphicData>
+            </a:graphic>
+          </wp:inline>
+        </w:drawing>
+      </w:r>
+      <w:r>
+        <w:t xml:space="preserve">  </w:t>
+      </w:r>
+      <w:r>
+        <w:drawing>
+          <wp:inline xmlns:a="http://schemas.openxmlformats.org/drawingml/2006/main" xmlns:pic="http://schemas.openxmlformats.org/drawingml/2006/picture">
+            <wp:extent cx="3024000" cy="2268000"/>
+            <wp:docPr id="7" name="Picture 7"/>
+            <wp:cNvGraphicFramePr>
+              <a:graphicFrameLocks noChangeAspect="1"/>
+            </wp:cNvGraphicFramePr>
+            <a:graphic>
+              <a:graphicData uri="http://schemas.openxmlformats.org/drawingml/2006/picture">
+                <pic:pic>
+                  <pic:nvPicPr>
+                    <pic:cNvPr id="0" name="2026-10-17_c1_security_wrong_token_403.jpg"/>
+                    <pic:cNvPicPr/>
+                  </pic:nvPicPr>
+                  <pic:blipFill>
+                    <a:blip r:embed="rId11"/>
+                    <a:stretch>
+                      <a:fillRect/>
+                    </a:stretch>
+                  </pic:blipFill>
+                  <pic:spPr>
+                    <a:xfrm>
+                      <a:off x="0" y="0"/>
+                      <a:ext cx="3024000" cy="2268000"/>
+                    </a:xfrm>
+                    <a:prstGeom prst="rect"/>
+                  </pic:spPr>
+                </pic:pic>
+              </a:graphicData>
+            </a:graphic>
+          </wp:inline>
+        </w:drawing>
+      </w:r>
+    </w:p>
+    <w:p>
+      <w:pPr>
+        <w:pStyle w:val="Caption"/>
+      </w:pPr>
+      <w:r>
+        <w:t>Figure A3c (left). R1: second check-in at T2 refused (409). Figure A3d (right). Check-out with another student's token refused (403); T2 stays occupied.</w:t>
+      </w:r>
+    </w:p>
+    <w:p>
+      <w:pPr/>
+      <w:r>
+        <w:drawing>
+          <wp:inline xmlns:a="http://schemas.openxmlformats.org/drawingml/2006/main" xmlns:pic="http://schemas.openxmlformats.org/drawingml/2006/picture">
+            <wp:extent cx="3024000" cy="2268000"/>
+            <wp:docPr id="8" name="Picture 8"/>
+            <wp:cNvGraphicFramePr>
+              <a:graphicFrameLocks noChangeAspect="1"/>
+            </wp:cNvGraphicFramePr>
+            <a:graphic>
+              <a:graphicData uri="http://schemas.openxmlformats.org/drawingml/2006/picture">
+                <pic:pic>
+                  <pic:nvPicPr>
+                    <pic:cNvPr id="0" name="2026-10-17_c1_s2-ac2_checkout.jpg"/>
+                    <pic:cNvPicPr/>
+                  </pic:nvPicPr>
+                  <pic:blipFill>
+                    <a:blip r:embed="rId12"/>
+                    <a:stretch>
+                      <a:fillRect/>
+                    </a:stretch>
+                  </pic:blipFill>
+                  <pic:spPr>
+                    <a:xfrm>
+                      <a:off x="0" y="0"/>
+                      <a:ext cx="3024000" cy="2268000"/>
+                    </a:xfrm>
+                    <a:prstGeom prst="rect"/>
+                  </pic:spPr>
+                </pic:pic>
+              </a:graphicData>
+            </a:graphic>
+          </wp:inline>
+        </w:drawing>
+      </w:r>
+    </w:p>
+    <w:p>
+      <w:pPr>
+        <w:pStyle w:val="Caption"/>
+      </w:pPr>
+      <w:r>
+        <w:t>Figure A3e. S2-AC2: after "I'm leaving", T2 is free again.</w:t>
       </w:r>
     </w:p>
     <w:p>
@@ -3490,6 +4231,9 @@
       </w:hyperlink>
       <w:r>
         <w:t xml:space="preserve">.</w:t>
+      </w:r>
+      <w:r>
+        <w:t xml:space="preserve"> Front-end: #26 C1 map UI and S2 buttons.</w:t>
       </w:r>
     </w:p>
     <w:p>

</xml_diff>

<commit_message>
docs(report): cover on its own page, Figure 2 in section 5, A3 layout
- Cover on page 1, body on pages 2-6
- Section 5: screenshot of the map after a check-in, to show the working feature
- A3: images narrow enough to sit two per line, as the captions say
- A4: links to #26 and #27; A5 and Esteve's report: AI_USAGE entry 11

Co-Authored-By: Claude Opus 5.5 <noreply@anthropic.com>
</commit_message>
<xml_diff>
--- a/docs/report/15_Midterm.docx
+++ b/docs/report/15_Midterm.docx
@@ -397,6 +397,7 @@
     <w:p>
       <w:pPr>
         <w:pStyle w:val="Heading1"/>
+        <w:pageBreakBefore/>
       </w:pPr>
       <w:r>
         <w:t xml:space="preserve">1 Product and problem</w:t>
@@ -2500,6 +2501,55 @@
         <w:t xml:space="preserve"> S1 and S2 work end to end in the browser. A student's check-in makes the table occupied on the map, a second check-in is refused, only the token holder can free the table, and the map shows a message when no table is free.</w:t>
       </w:r>
     </w:p>
+    <w:p>
+      <w:pPr>
+        <w:jc w:val="center"/>
+        <w:spacing w:after="0"/>
+      </w:pPr>
+      <w:r>
+        <w:drawing>
+          <wp:inline xmlns:a="http://schemas.openxmlformats.org/drawingml/2006/main" xmlns:pic="http://schemas.openxmlformats.org/drawingml/2006/picture">
+            <wp:extent cx="3200400" cy="2400300"/>
+            <wp:docPr id="9" name="Picture 9"/>
+            <wp:cNvGraphicFramePr>
+              <a:graphicFrameLocks noChangeAspect="1"/>
+            </wp:cNvGraphicFramePr>
+            <a:graphic>
+              <a:graphicData uri="http://schemas.openxmlformats.org/drawingml/2006/picture">
+                <pic:pic>
+                  <pic:nvPicPr>
+                    <pic:cNvPr id="9" name="Picture 9"/>
+                    <pic:cNvPicPr/>
+                  </pic:nvPicPr>
+                  <pic:blipFill>
+                    <a:blip r:embed="rId8"/>
+                    <a:stretch>
+                      <a:fillRect/>
+                    </a:stretch>
+                  </pic:blipFill>
+                  <pic:spPr>
+                    <a:xfrm>
+                      <a:off x="0" y="0"/>
+                      <a:ext cx="3200400" cy="2400300"/>
+                    </a:xfrm>
+                    <a:prstGeom prst="rect"/>
+                  </pic:spPr>
+                </pic:pic>
+              </a:graphicData>
+            </a:graphic>
+          </wp:inline>
+        </w:drawing>
+      </w:r>
+    </w:p>
+    <w:p>
+      <w:pPr>
+        <w:pStyle w:val="Caption"/>
+        <w:jc w:val="center"/>
+      </w:pPr>
+      <w:r>
+        <w:t xml:space="preserve">Figure 2. The map after "I'm sitting here" on T2: T2 occupied, the other tables free, each with a colour and a text label (S1-AC1, S2-AC1). More screenshots in A3.</w:t>
+      </w:r>
+    </w:p>
     <w:tbl>
       <w:tblPr>
         <w:tblStyle w:val="TableGrid"/>
@@ -3962,7 +4012,7 @@
       <w:r>
         <w:drawing>
           <wp:inline xmlns:a="http://schemas.openxmlformats.org/drawingml/2006/main" xmlns:pic="http://schemas.openxmlformats.org/drawingml/2006/picture">
-            <wp:extent cx="3024000" cy="2268000"/>
+            <wp:extent cx="2834640" cy="2125980"/>
             <wp:docPr id="4" name="Picture 4"/>
             <wp:cNvGraphicFramePr>
               <a:graphicFrameLocks noChangeAspect="1"/>
@@ -3983,7 +4033,7 @@
                   <pic:spPr>
                     <a:xfrm>
                       <a:off x="0" y="0"/>
-                      <a:ext cx="3024000" cy="2268000"/>
+                      <a:ext cx="2834640" cy="2125980"/>
                     </a:xfrm>
                     <a:prstGeom prst="rect"/>
                   </pic:spPr>
@@ -3999,7 +4049,7 @@
       <w:r>
         <w:drawing>
           <wp:inline xmlns:a="http://schemas.openxmlformats.org/drawingml/2006/main" xmlns:pic="http://schemas.openxmlformats.org/drawingml/2006/picture">
-            <wp:extent cx="3024000" cy="2268000"/>
+            <wp:extent cx="2834640" cy="2125980"/>
             <wp:docPr id="5" name="Picture 5"/>
             <wp:cNvGraphicFramePr>
               <a:graphicFrameLocks noChangeAspect="1"/>
@@ -4020,7 +4070,7 @@
                   <pic:spPr>
                     <a:xfrm>
                       <a:off x="0" y="0"/>
-                      <a:ext cx="3024000" cy="2268000"/>
+                      <a:ext cx="2834640" cy="2125980"/>
                     </a:xfrm>
                     <a:prstGeom prst="rect"/>
                   </pic:spPr>
@@ -4044,7 +4094,7 @@
       <w:r>
         <w:drawing>
           <wp:inline xmlns:a="http://schemas.openxmlformats.org/drawingml/2006/main" xmlns:pic="http://schemas.openxmlformats.org/drawingml/2006/picture">
-            <wp:extent cx="3024000" cy="2268000"/>
+            <wp:extent cx="2834640" cy="2125980"/>
             <wp:docPr id="6" name="Picture 6"/>
             <wp:cNvGraphicFramePr>
               <a:graphicFrameLocks noChangeAspect="1"/>
@@ -4065,7 +4115,7 @@
                   <pic:spPr>
                     <a:xfrm>
                       <a:off x="0" y="0"/>
-                      <a:ext cx="3024000" cy="2268000"/>
+                      <a:ext cx="2834640" cy="2125980"/>
                     </a:xfrm>
                     <a:prstGeom prst="rect"/>
                   </pic:spPr>
@@ -4081,7 +4131,7 @@
       <w:r>
         <w:drawing>
           <wp:inline xmlns:a="http://schemas.openxmlformats.org/drawingml/2006/main" xmlns:pic="http://schemas.openxmlformats.org/drawingml/2006/picture">
-            <wp:extent cx="3024000" cy="2268000"/>
+            <wp:extent cx="2834640" cy="2125980"/>
             <wp:docPr id="7" name="Picture 7"/>
             <wp:cNvGraphicFramePr>
               <a:graphicFrameLocks noChangeAspect="1"/>
@@ -4102,7 +4152,7 @@
                   <pic:spPr>
                     <a:xfrm>
                       <a:off x="0" y="0"/>
-                      <a:ext cx="3024000" cy="2268000"/>
+                      <a:ext cx="2834640" cy="2125980"/>
                     </a:xfrm>
                     <a:prstGeom prst="rect"/>
                   </pic:spPr>
@@ -4126,7 +4176,7 @@
       <w:r>
         <w:drawing>
           <wp:inline xmlns:a="http://schemas.openxmlformats.org/drawingml/2006/main" xmlns:pic="http://schemas.openxmlformats.org/drawingml/2006/picture">
-            <wp:extent cx="3024000" cy="2268000"/>
+            <wp:extent cx="2834640" cy="2125980"/>
             <wp:docPr id="8" name="Picture 8"/>
             <wp:cNvGraphicFramePr>
               <a:graphicFrameLocks noChangeAspect="1"/>
@@ -4147,7 +4197,7 @@
                   <pic:spPr>
                     <a:xfrm>
                       <a:off x="0" y="0"/>
-                      <a:ext cx="3024000" cy="2268000"/>
+                      <a:ext cx="2834640" cy="2125980"/>
                     </a:xfrm>
                     <a:prstGeom prst="rect"/>
                   </pic:spPr>
@@ -4233,7 +4283,31 @@
         <w:t xml:space="preserve">.</w:t>
       </w:r>
       <w:r>
-        <w:t xml:space="preserve"> Front-end: #26 C1 map UI and S2 buttons.</w:t>
+        <w:t xml:space="preserve"> Front-end: </w:t>
+      </w:r>
+      <w:hyperlink r:id="rId117">
+        <w:r>
+          <w:rPr>
+            <w:u w:val="single"/>
+            <w:color w:val="1155CC"/>
+          </w:rPr>
+          <w:t xml:space="preserve">#26 C1 map UI and S2 buttons</w:t>
+        </w:r>
+      </w:hyperlink>
+      <w:r>
+        <w:t xml:space="preserve"> . Review follow-ups: </w:t>
+      </w:r>
+      <w:hyperlink r:id="rId118">
+        <w:r>
+          <w:rPr>
+            <w:u w:val="single"/>
+            <w:color w:val="1155CC"/>
+          </w:rPr>
+          <w:t xml:space="preserve">#27</w:t>
+        </w:r>
+      </w:hyperlink>
+      <w:r>
+        <w:t xml:space="preserve"> .</w:t>
       </w:r>
     </w:p>
     <w:p>
@@ -4281,7 +4355,7 @@
         </w:r>
       </w:hyperlink>
       <w:r>
-        <w:t xml:space="preserve"> (entries 1–10): the purpose, the input, the output, what the AI did not do, and the team's checks.</w:t>
+        <w:t xml:space="preserve"> (entries 1–11): the purpose, the input, the output, what the AI did not do, and the team's checks.</w:t>
       </w:r>
     </w:p>
     <w:p>

</xml_diff>

<commit_message>
docs: Esteve's UI re-run (step 1) and tag link on the cover
- Evidence: Esteve's check-in at T1 on 2026-10-20, with screenshot; steps 2-5 not re-run
- AI_USAGE entry 10: team checks updated
- Report: cover points to the midterm-v1 tag; section 5 and A3 name the re-run

Co-Authored-By: Claude Opus 5.5 <noreply@anthropic.com>
</commit_message>
<xml_diff>
--- a/docs/report/15_Midterm.docx
+++ b/docs/report/15_Midterm.docx
@@ -268,20 +268,7 @@
               <w:rPr>
                 <w:sz w:val="20"/>
               </w:rPr>
-              <w:t xml:space="preserve"> (commit: </w:t>
-            </w:r>
-            <w:r>
-              <w:rPr>
-                <w:i/>
-                <w:sz w:val="20"/>
-              </w:rPr>
-              <w:t xml:space="preserve">to fill at submission</w:t>
-            </w:r>
-            <w:r>
-              <w:rPr>
-                <w:sz w:val="20"/>
-              </w:rPr>
-              <w:t xml:space="preserve">)</w:t>
+              <w:t xml:space="preserve"> (github.com/estvv/software-engineering-project/tree/midterm-v1)</w:t>
             </w:r>
           </w:p>
         </w:tc>
@@ -3084,7 +3071,7 @@
         <w:t>Browser check of the UI, 5/5.</w:t>
       </w:r>
       <w:r>
-        <w:t xml:space="preserve"> On the production build, five steps covering S1-AC1, S1-AC2, S2-AC1, S2-AC2, R1 and the wrong-token case each showed the expected statuses and messages. Run by Claude Code on Adam's machine on 2026-10-17 (A3).</w:t>
+        <w:t xml:space="preserve"> On the production build, five steps covering S1-AC1, S1-AC2, S2-AC1, S2-AC2, R1 and the wrong-token case each showed the expected statuses and messages. Run by Claude Code on Adam's machine on 2026-10-17; step 1 re-run by Esteve on 2026-10-20 (A3).</w:t>
       </w:r>
     </w:p>
     <w:p>
@@ -3984,7 +3971,7 @@
     <w:p>
       <w:pPr/>
       <w:r>
-        <w:t xml:space="preserve">Production build in a browser, run by Claude Code on Adam LARKEM's machine on 2026-10-17, branch </w:t>
+        <w:t xml:space="preserve">Step 1 re-run by Esteve BASCUNANA on 2026-10-20 (screenshot in the same file). Production build in a browser, run by Claude Code on Adam LARKEM's machine on 2026-10-17, branch </w:t>
       </w:r>
       <w:r>
         <w:rPr>

</xml_diff>

<commit_message>
docs(report): plan up to the final demo, map marked partial
- Section 7: S3 targeted at Weeks 11-12; rows for M5 (Week 13) and the final demo M6 (Week 15)
- Sections 2 and 5: the map is partial (no automatic refresh), as the guide asks to mark

Co-Authored-By: Claude Opus 5.5 <noreply@anthropic.com>
</commit_message>
<xml_diff>
--- a/docs/report/15_Midterm.docx
+++ b/docs/report/15_Midterm.docx
@@ -882,7 +882,7 @@
               <w:rPr>
                 <w:sz w:val="19"/>
               </w:rPr>
-              <w:t>Complete on a temporary layout (backend + map UI)</w:t>
+              <w:t>Partial: works on a temporary layout; the map does not refresh by itself</w:t>
             </w:r>
           </w:p>
         </w:tc>
@@ -2765,7 +2765,7 @@
               <w:rPr>
                 <w:sz w:val="19"/>
               </w:rPr>
-              <w:t>Complete (Adam)</w:t>
+              <w:t>Partial (Adam): S1-AC1, S1-AC2 met; no automatic refresh</w:t>
             </w:r>
           </w:p>
         </w:tc>
@@ -3623,7 +3623,7 @@
               <w:rPr>
                 <w:sz w:val="19"/>
               </w:rPr>
-              <w:t>Adam (UI), Esteve (C2, API), after M4</w:t>
+              <w:t>Adam (UI), Esteve (C2, API), Weeks 11–12</w:t>
             </w:r>
           </w:p>
         </w:tc>
@@ -3640,6 +3640,112 @@
                 <w:sz w:val="19"/>
               </w:rPr>
               <w:t>Opt-in status on the map, with the privacy rules of section 6</w:t>
+            </w:r>
+          </w:p>
+        </w:tc>
+      </w:tr>
+      <w:tr>
+        <w:trPr>
+          <w:cantSplit/>
+        </w:trPr>
+        <w:tc>
+          <w:tcPr>
+            <w:tcW w:w="4649" w:type="dxa"/>
+          </w:tcPr>
+          <w:p>
+            <w:pPr>
+              <w:spacing w:before="0" w:after="0"/>
+            </w:pPr>
+            <w:r>
+              <w:rPr>
+                <w:sz w:val="19"/>
+              </w:rPr>
+              <w:t>6. Release candidate (M5): fixes from the MVP demo, security limits of section 6 revisited</w:t>
+            </w:r>
+          </w:p>
+        </w:tc>
+        <w:tc>
+          <w:tcPr>
+            <w:tcW w:w="2154" w:type="dxa"/>
+          </w:tcPr>
+          <w:p>
+            <w:pPr>
+              <w:spacing w:before="0" w:after="0"/>
+            </w:pPr>
+            <w:r>
+              <w:rPr>
+                <w:sz w:val="19"/>
+              </w:rPr>
+              <w:t>Both, Week 13</w:t>
+            </w:r>
+          </w:p>
+        </w:tc>
+        <w:tc>
+          <w:tcPr>
+            <w:tcW w:w="3061" w:type="dxa"/>
+          </w:tcPr>
+          <w:p>
+            <w:pPr>
+              <w:spacing w:before="0" w:after="0"/>
+            </w:pPr>
+            <w:r>
+              <w:rPr>
+                <w:sz w:val="19"/>
+              </w:rPr>
+              <w:t>S1 and S2 (and F3 if built) pass their criteria on the release build; known issues listed</w:t>
+            </w:r>
+          </w:p>
+        </w:tc>
+      </w:tr>
+      <w:tr>
+        <w:trPr>
+          <w:cantSplit/>
+        </w:trPr>
+        <w:tc>
+          <w:tcPr>
+            <w:tcW w:w="4649" w:type="dxa"/>
+          </w:tcPr>
+          <w:p>
+            <w:pPr>
+              <w:spacing w:before="0" w:after="0"/>
+            </w:pPr>
+            <w:r>
+              <w:rPr>
+                <w:sz w:val="19"/>
+              </w:rPr>
+              <w:t>7. Final demo (M6)</w:t>
+            </w:r>
+          </w:p>
+        </w:tc>
+        <w:tc>
+          <w:tcPr>
+            <w:tcW w:w="2154" w:type="dxa"/>
+          </w:tcPr>
+          <w:p>
+            <w:pPr>
+              <w:spacing w:before="0" w:after="0"/>
+            </w:pPr>
+            <w:r>
+              <w:rPr>
+                <w:sz w:val="19"/>
+              </w:rPr>
+              <w:t>Both, Week 15</w:t>
+            </w:r>
+          </w:p>
+        </w:tc>
+        <w:tc>
+          <w:tcPr>
+            <w:tcW w:w="3061" w:type="dxa"/>
+          </w:tcPr>
+          <w:p>
+            <w:pPr>
+              <w:spacing w:before="0" w:after="0"/>
+            </w:pPr>
+            <w:r>
+              <w:rPr>
+                <w:sz w:val="19"/>
+              </w:rPr>
+              <w:t>Main task shown live on the real layout; evidence and AI_USAGE.md up to date</w:t>
             </w:r>
           </w:p>
         </w:tc>

</xml_diff>

<commit_message>
docs(report): remove em dashes, review fixes
- No em dash left (title, appendix headings, empty cell)
- A4: stray spaces after the #26/#27 links; "color" spelled one way
- A3 intro reordered; D1 check points to the evidence file
- A5: Adam's own re-run of tests, build and lint before approving #7/#8

Co-Authored-By: Claude Opus 5.5 <noreply@anthropic.com>
</commit_message>
<xml_diff>
--- a/docs/report/15_Midterm.docx
+++ b/docs/report/15_Midterm.docx
@@ -7,7 +7,7 @@
         <w:pStyle w:val="Title"/>
       </w:pPr>
       <w:r>
-        <w:t xml:space="preserve">SeatTogether — Team Midterm Report</w:t>
+        <w:t xml:space="preserve">SeatTogether: Team Midterm Report</w:t>
       </w:r>
     </w:p>
     <w:p>
@@ -2466,7 +2466,7 @@
         <w:t>app/page.tsx</w:t>
       </w:r>
       <w:r>
-        <w:t xml:space="preserve"> (A3).</w:t>
+        <w:t xml:space="preserve"> (D1 check in the evidence file of A3).</w:t>
       </w:r>
     </w:p>
     <w:p>
@@ -2534,7 +2534,7 @@
         <w:jc w:val="center"/>
       </w:pPr>
       <w:r>
-        <w:t xml:space="preserve">Figure 2. The map after "I'm sitting here" on T2: T2 occupied, the other tables free, each with a colour and a text label (S1-AC1, S2-AC1). More screenshots in A3.</w:t>
+        <w:t xml:space="preserve">Figure 2. The map after "I'm sitting here" on T2: T2 occupied, the other tables free, each with a color and a text label (S1-AC1, S2-AC1). More screenshots in A3.</w:t>
       </w:r>
     </w:p>
     <w:tbl>
@@ -2993,7 +2993,7 @@
               <w:rPr>
                 <w:sz w:val="19"/>
               </w:rPr>
-              <w:t xml:space="preserve">—</w:t>
+              <w:t xml:space="preserve">None</w:t>
             </w:r>
           </w:p>
         </w:tc>
@@ -3135,7 +3135,7 @@
         <w:t>GET /api/tables</w:t>
       </w:r>
       <w:r>
-        <w:t xml:space="preserve">, draws the grid from each table's row and column, and gives each table a colour and a text label (free / occupied), so the status does not rely on colour alone. When </w:t>
+        <w:t xml:space="preserve">, draws the grid from each table's row and column, and gives each table a color and a text label (free / occupied), so the status does not rely on color alone. When </w:t>
       </w:r>
       <w:r>
         <w:rPr>
@@ -3900,7 +3900,7 @@
         <w:rPr>
           <w:sz w:val="22"/>
         </w:rPr>
-        <w:t xml:space="preserve">A1 Automated tests — supports S1-AC1, S1-AC2, S2-AC1, S2-AC2, R1, R2, token check</w:t>
+        <w:t xml:space="preserve">A1 Automated tests: supports S1-AC1, S1-AC2, S2-AC1, S2-AC2, R1, R2, token check</w:t>
       </w:r>
     </w:p>
     <w:p>
@@ -3981,7 +3981,7 @@
         <w:rPr>
           <w:sz w:val="22"/>
         </w:rPr>
-        <w:t xml:space="preserve">A2 Manual API check — supports S2-AC1, S2-AC2, R1, token check</w:t>
+        <w:t xml:space="preserve">A2 Manual API check: supports S2-AC1, S2-AC2, R1, token check</w:t>
       </w:r>
     </w:p>
     <w:p>
@@ -4071,13 +4071,13 @@
         <w:pStyle w:val="Heading2"/>
       </w:pPr>
       <w:r>
-        <w:t>A3 UI screenshots — supports S1-AC1, S1-AC2, S2-AC1, S2-AC2, R1, token check</w:t>
+        <w:t>A3 UI screenshots: supports S1-AC1, S1-AC2, S2-AC1, S2-AC2, R1, token check</w:t>
       </w:r>
     </w:p>
     <w:p>
       <w:pPr/>
       <w:r>
-        <w:t xml:space="preserve">Step 1 re-run by Esteve BASCUNANA on 2026-10-20 (screenshot in the same file). Production build in a browser, run by Claude Code on Adam LARKEM's machine on 2026-10-17, branch </w:t>
+        <w:t xml:space="preserve">Production build in a browser, run by Claude Code on Adam LARKEM's machine on 2026-10-17, branch </w:t>
       </w:r>
       <w:r>
         <w:rPr>
@@ -4087,7 +4087,7 @@
         <w:t>feat/c1-map-ui</w:t>
       </w:r>
       <w:r>
-        <w:t xml:space="preserve">. Steps and expected results: </w:t>
+        <w:t xml:space="preserve">; step 1 re-run by Esteve BASCUNANA on 2026-10-20. Steps, expected results and Esteve's screenshot: </w:t>
       </w:r>
       <w:r>
         <w:rPr>
@@ -4388,7 +4388,7 @@
         </w:r>
       </w:hyperlink>
       <w:r>
-        <w:t xml:space="preserve"> . Review follow-ups: </w:t>
+        <w:t xml:space="preserve">. Review follow-ups: </w:t>
       </w:r>
       <w:hyperlink r:id="rId118">
         <w:r>
@@ -4400,7 +4400,7 @@
         </w:r>
       </w:hyperlink>
       <w:r>
-        <w:t xml:space="preserve"> .</w:t>
+        <w:t xml:space="preserve">.</w:t>
       </w:r>
     </w:p>
     <w:p>
@@ -4500,7 +4500,7 @@
         <w:t xml:space="preserve">How we verified it:</w:t>
       </w:r>
       <w:r>
-        <w:t xml:space="preserve"> Adam reviewed the documents on pull requests and asked for changes (AI_USAGE entries 2, 3, 5); Esteve re-ran the tests and the API check himself (A1, A2); Adam set the UI decisions in his PR #8 review before the map UI was coded (AI_USAGE entry 10). AI output is never reported as user research or as a test result.</w:t>
+        <w:t xml:space="preserve"> Adam reviewed the documents on pull requests and asked for changes (AI_USAGE entries 2, 3, 5); Adam re-ran the tests, build and lint on a fresh clone before approving the backend (PRs #7, #8); Esteve re-ran the tests and the API check himself (A1, A2) and step 1 of the UI check (A3); Adam set the UI decisions in his PR #8 review before the map UI was coded (AI_USAGE entry 10). AI output is never reported as user research or as a test result.</w:t>
       </w:r>
     </w:p>
     <w:sectPr>

</xml_diff>